<commit_message>
chore(web): afegeix .gitignore i neteja fitxers generats
- Afegit web/.gitignore: exclou uploads/*, __pycache__, .venv, .DS_Store,
  fitxers generats (retracto_corregit, etc.), bloqueja plantilla.docx
- Afegit uploads/.gitkeep per preservar el directori al repo
- Inclou canvis pendents a app.py, style.css, index.html, plantilla.docx

Co-Authored-By: Claude Sonnet 4.6 <noreply@anthropic.com>
</commit_message>
<xml_diff>
--- a/web/resources/plantilla.docx
+++ b/web/resources/plantilla.docx
@@ -62,9 +62,7 @@
                       <wp:extent cx="1556385" cy="374015"/>
                       <wp:effectExtent l="0" t="0" r="0" b="0"/>
                       <wp:wrapNone/>
-                      <wp:docPr id="1" name="Imagen 4" descr="http://indret.b.wetopi.com/wp-content/themes/indret/img/logo.png">
-                        <a:hlinkClick xmlns:a="http://schemas.openxmlformats.org/drawingml/2006/main" r:id="rId2"/>
-                      </wp:docPr>
+                      <wp:docPr id="1" name="Imagen 4" descr="http://indret.b.wetopi.com/wp-content/themes/indret/img/logo.png"/>
                       <a:graphic xmlns:a="http://schemas.openxmlformats.org/drawingml/2006/main">
                         <a:graphicData uri="http://schemas.openxmlformats.org/drawingml/2006/picture">
                           <pic:pic xmlns:pic="http://schemas.openxmlformats.org/drawingml/2006/picture">
@@ -128,7 +126,7 @@
                       <v:path o:extrusionok="f" gradientshapeok="t" o:connecttype="rect"/>
                       <o:lock v:ext="edit" aspectratio="t"/>
                     </v:shapetype>
-                    <v:shape id="shape_0" ID="Imagen 4" stroked="f" href="http://indret.b.wetopi.com/" o:allowincell="t" style="position:absolute;margin-left:-22.15pt;margin-top:-3.2pt;width:122.5pt;height:29.4pt;mso-wrap-style:none;v-text-anchor:middle" wp14:anchorId="0D7D6C37" type="_x0000_t75">
+                    <v:shape id="shape_0" ID="Imagen 4" stroked="f" o:allowincell="t" style="position:absolute;margin-left:-22.15pt;margin-top:-3.2pt;width:122.5pt;height:29.4pt;mso-wrap-style:none;v-text-anchor:middle" wp14:anchorId="0D7D6C37" type="_x0000_t75">
                       <v:imagedata r:id="rId5" o:detectmouseclick="t"/>
                       <v:stroke color="#3465a4" joinstyle="round" endcap="flat"/>
                       <w10:wrap type="none"/>
@@ -894,9 +892,7 @@
                       <wp:extent cx="1556385" cy="374015"/>
                       <wp:effectExtent l="0" t="0" r="0" b="0"/>
                       <wp:wrapNone/>
-                      <wp:docPr id="3" name="Imagen 3" descr="http://indret.b.wetopi.com/wp-content/themes/indret/img/logo.png">
-                        <a:hlinkClick xmlns:a="http://schemas.openxmlformats.org/drawingml/2006/main" r:id="rId9"/>
-                      </wp:docPr>
+                      <wp:docPr id="3" name="Imagen 3" descr="http://indret.b.wetopi.com/wp-content/themes/indret/img/logo.png"/>
                       <a:graphic xmlns:a="http://schemas.openxmlformats.org/drawingml/2006/main">
                         <a:graphicData uri="http://schemas.openxmlformats.org/drawingml/2006/picture">
                           <pic:pic xmlns:pic="http://schemas.openxmlformats.org/drawingml/2006/picture">
@@ -941,7 +937,7 @@
                 </mc:Choice>
                 <mc:Fallback>
                   <w:pict>
-                    <v:shape id="shape_0" ID="Imagen 3" stroked="f" href="http://indret.b.wetopi.com/" o:allowincell="t" style="position:absolute;margin-left:-22pt;margin-top:-8.1pt;width:122.5pt;height:29.4pt;mso-wrap-style:none;v-text-anchor:middle" wp14:anchorId="542856FB" type="_x0000_t75">
+                    <v:shape id="shape_0" ID="Imagen 3" stroked="f" o:allowincell="t" style="position:absolute;margin-left:-22pt;margin-top:-8.1pt;width:122.5pt;height:29.4pt;mso-wrap-style:none;v-text-anchor:middle" wp14:anchorId="542856FB" type="_x0000_t75">
                       <v:imagedata r:id="rId11" o:detectmouseclick="t"/>
                       <v:stroke color="#3465a4" joinstyle="round" endcap="flat"/>
                       <w10:wrap type="none"/>
@@ -1356,7 +1352,7 @@
             </w:r>
             <w:r>
               <w:rPr>
-                <w:rFonts w:cs="Open Sans" w:ascii="Open Sans" w:hAnsi="Open Sans"/>
+                <w:rFonts w:cs="Open Sans" w:ascii="Work Sans" w:hAnsi="Work Sans"/>
                 <w:b w:val="false"/>
                 <w:bCs w:val="false"/>
                 <w:sz w:val="18"/>
@@ -4014,6 +4010,12 @@
       <w:r>
         <w:rPr>
           <w:rStyle w:val="FootnoteCharacters"/>
+        </w:rPr>
+        <w:t></w:t>
+      </w:r>
+      <w:r>
+        <w:rPr>
+          <w:rStyle w:val="FootnoteCharactersuser"/>
         </w:rPr>
         <w:t></w:t>
       </w:r>
@@ -5902,8 +5904,8 @@
       <w:szCs w:val="24"/>
     </w:rPr>
   </w:style>
-  <w:style w:type="character" w:styleId="FootnoteCharacters">
-    <w:name w:val="Footnote Characters"/>
+  <w:style w:type="character" w:styleId="FootnoteCharactersuser">
+    <w:name w:val="Footnote Characters (user)"/>
     <w:unhideWhenUsed/>
     <w:qFormat/>
     <w:rsid w:val="0029096c"/>
@@ -5911,8 +5913,8 @@
       <w:vertAlign w:val="superscript"/>
     </w:rPr>
   </w:style>
-  <w:style w:type="character" w:styleId="FootnoteCharactersuser">
-    <w:name w:val="Footnote Characters (user)"/>
+  <w:style w:type="character" w:styleId="FootnoteCharacters">
+    <w:name w:val="Footnote Characters"/>
     <w:qFormat/>
     <w:rPr>
       <w:vertAlign w:val="superscript"/>
@@ -5942,15 +5944,15 @@
     <w:rsid w:val="00d67a98"/>
     <w:rPr/>
   </w:style>
-  <w:style w:type="character" w:styleId="EndnoteCharactersuser">
-    <w:name w:val="Endnote Characters (user)"/>
+  <w:style w:type="character" w:styleId="EndnoteCharacters">
+    <w:name w:val="Endnote Characters"/>
     <w:qFormat/>
     <w:rPr>
       <w:vertAlign w:val="superscript"/>
     </w:rPr>
   </w:style>
-  <w:style w:type="character" w:styleId="EndnoteCharacters">
-    <w:name w:val="Endnote Characters"/>
+  <w:style w:type="character" w:styleId="EndnoteCharactersuser">
+    <w:name w:val="Endnote Characters (user)"/>
     <w:qFormat/>
     <w:rPr/>
   </w:style>

</xml_diff>